<commit_message>
doc: ajout de la section 'Choix techniques' au rapport
</commit_message>
<xml_diff>
--- a/Rapport Docker Avancé.docx
+++ b/Rapport Docker Avancé.docx
@@ -51,6 +51,15 @@
     </w:p>
     <w:sdt>
       <w:sdtPr>
+        <w:rPr>
+          <w:rFonts w:asciiTheme="minorHAnsi" w:eastAsiaTheme="minorHAnsi" w:hAnsiTheme="minorHAnsi" w:cstheme="minorBidi"/>
+          <w:color w:val="auto"/>
+          <w:kern w:val="2"/>
+          <w:sz w:val="24"/>
+          <w:szCs w:val="24"/>
+          <w:lang w:eastAsia="en-US"/>
+          <w14:ligatures w14:val="standardContextual"/>
+        </w:rPr>
         <w:id w:val="667300601"/>
         <w:docPartObj>
           <w:docPartGallery w:val="Table of Contents"/>
@@ -59,15 +68,8 @@
       </w:sdtPr>
       <w:sdtEndPr>
         <w:rPr>
-          <w:rFonts w:asciiTheme="minorHAnsi" w:eastAsiaTheme="minorHAnsi" w:hAnsiTheme="minorHAnsi" w:cstheme="minorBidi"/>
           <w:b/>
           <w:bCs/>
-          <w:color w:val="auto"/>
-          <w:kern w:val="2"/>
-          <w:sz w:val="24"/>
-          <w:szCs w:val="24"/>
-          <w:lang w:eastAsia="en-US"/>
-          <w14:ligatures w14:val="standardContextual"/>
         </w:rPr>
       </w:sdtEndPr>
       <w:sdtContent>
@@ -100,12 +102,82 @@
           <w:r>
             <w:fldChar w:fldCharType="separate"/>
           </w:r>
-          <w:hyperlink w:anchor="_Toc223190851" w:history="1">
+          <w:hyperlink w:anchor="_Toc223193694" w:history="1">
             <w:r>
               <w:rPr>
                 <w:rStyle w:val="Lienhypertexte"/>
                 <w:noProof/>
               </w:rPr>
+              <w:t>Choix techniques</w:t>
+            </w:r>
+            <w:r>
+              <w:rPr>
+                <w:noProof/>
+                <w:webHidden/>
+              </w:rPr>
+              <w:tab/>
+            </w:r>
+            <w:r>
+              <w:rPr>
+                <w:noProof/>
+                <w:webHidden/>
+              </w:rPr>
+              <w:fldChar w:fldCharType="begin"/>
+            </w:r>
+            <w:r>
+              <w:rPr>
+                <w:noProof/>
+                <w:webHidden/>
+              </w:rPr>
+              <w:instrText xml:space="preserve"> PAGEREF _Toc223193694 \h </w:instrText>
+            </w:r>
+            <w:r>
+              <w:rPr>
+                <w:noProof/>
+                <w:webHidden/>
+              </w:rPr>
+            </w:r>
+            <w:r>
+              <w:rPr>
+                <w:noProof/>
+                <w:webHidden/>
+              </w:rPr>
+              <w:fldChar w:fldCharType="separate"/>
+            </w:r>
+            <w:r>
+              <w:rPr>
+                <w:noProof/>
+                <w:webHidden/>
+              </w:rPr>
+              <w:t>2</w:t>
+            </w:r>
+            <w:r>
+              <w:rPr>
+                <w:noProof/>
+                <w:webHidden/>
+              </w:rPr>
+              <w:fldChar w:fldCharType="end"/>
+            </w:r>
+          </w:hyperlink>
+        </w:p>
+        <w:p>
+          <w:pPr>
+            <w:pStyle w:val="TM2"/>
+            <w:tabs>
+              <w:tab w:val="right" w:leader="dot" w:pos="9062"/>
+            </w:tabs>
+            <w:rPr>
+              <w:rFonts w:eastAsiaTheme="minorEastAsia"/>
+              <w:noProof/>
+              <w:lang w:eastAsia="fr-FR"/>
+            </w:rPr>
+          </w:pPr>
+          <w:hyperlink w:anchor="_Toc223193695" w:history="1">
+            <w:r>
+              <w:rPr>
+                <w:rStyle w:val="Lienhypertexte"/>
+                <w:noProof/>
+              </w:rPr>
               <w:t>VM-APP</w:t>
             </w:r>
             <w:r>
@@ -127,7 +199,7 @@
                 <w:noProof/>
                 <w:webHidden/>
               </w:rPr>
-              <w:instrText xml:space="preserve"> PAGEREF _Toc223190851 \h </w:instrText>
+              <w:instrText xml:space="preserve"> PAGEREF _Toc223193695 \h </w:instrText>
             </w:r>
             <w:r>
               <w:rPr>
@@ -170,7 +242,7 @@
               <w:lang w:eastAsia="fr-FR"/>
             </w:rPr>
           </w:pPr>
-          <w:hyperlink w:anchor="_Toc223190852" w:history="1">
+          <w:hyperlink w:anchor="_Toc223193696" w:history="1">
             <w:r>
               <w:rPr>
                 <w:rStyle w:val="Lienhypertexte"/>
@@ -197,7 +269,7 @@
                 <w:noProof/>
                 <w:webHidden/>
               </w:rPr>
-              <w:instrText xml:space="preserve"> PAGEREF _Toc223190852 \h </w:instrText>
+              <w:instrText xml:space="preserve"> PAGEREF _Toc223193696 \h </w:instrText>
             </w:r>
             <w:r>
               <w:rPr>
@@ -240,7 +312,7 @@
               <w:lang w:eastAsia="fr-FR"/>
             </w:rPr>
           </w:pPr>
-          <w:hyperlink w:anchor="_Toc223190853" w:history="1">
+          <w:hyperlink w:anchor="_Toc223193697" w:history="1">
             <w:r>
               <w:rPr>
                 <w:rStyle w:val="Lienhypertexte"/>
@@ -267,7 +339,7 @@
                 <w:noProof/>
                 <w:webHidden/>
               </w:rPr>
-              <w:instrText xml:space="preserve"> PAGEREF _Toc223190853 \h </w:instrText>
+              <w:instrText xml:space="preserve"> PAGEREF _Toc223193697 \h </w:instrText>
             </w:r>
             <w:r>
               <w:rPr>
@@ -310,7 +382,7 @@
               <w:lang w:eastAsia="fr-FR"/>
             </w:rPr>
           </w:pPr>
-          <w:hyperlink w:anchor="_Toc223190854" w:history="1">
+          <w:hyperlink w:anchor="_Toc223193698" w:history="1">
             <w:r>
               <w:rPr>
                 <w:rStyle w:val="Lienhypertexte"/>
@@ -337,7 +409,7 @@
                 <w:noProof/>
                 <w:webHidden/>
               </w:rPr>
-              <w:instrText xml:space="preserve"> PAGEREF _Toc223190854 \h </w:instrText>
+              <w:instrText xml:space="preserve"> PAGEREF _Toc223193698 \h </w:instrText>
             </w:r>
             <w:r>
               <w:rPr>
@@ -380,7 +452,7 @@
               <w:lang w:eastAsia="fr-FR"/>
             </w:rPr>
           </w:pPr>
-          <w:hyperlink w:anchor="_Toc223190855" w:history="1">
+          <w:hyperlink w:anchor="_Toc223193699" w:history="1">
             <w:r>
               <w:rPr>
                 <w:rStyle w:val="Lienhypertexte"/>
@@ -407,7 +479,7 @@
                 <w:noProof/>
                 <w:webHidden/>
               </w:rPr>
-              <w:instrText xml:space="preserve"> PAGEREF _Toc223190855 \h </w:instrText>
+              <w:instrText xml:space="preserve"> PAGEREF _Toc223193699 \h </w:instrText>
             </w:r>
             <w:r>
               <w:rPr>
@@ -450,7 +522,7 @@
               <w:lang w:eastAsia="fr-FR"/>
             </w:rPr>
           </w:pPr>
-          <w:hyperlink w:anchor="_Toc223190856" w:history="1">
+          <w:hyperlink w:anchor="_Toc223193700" w:history="1">
             <w:r>
               <w:rPr>
                 <w:rStyle w:val="Lienhypertexte"/>
@@ -477,7 +549,7 @@
                 <w:noProof/>
                 <w:webHidden/>
               </w:rPr>
-              <w:instrText xml:space="preserve"> PAGEREF _Toc223190856 \h </w:instrText>
+              <w:instrText xml:space="preserve"> PAGEREF _Toc223193700 \h </w:instrText>
             </w:r>
             <w:r>
               <w:rPr>
@@ -520,7 +592,7 @@
               <w:lang w:eastAsia="fr-FR"/>
             </w:rPr>
           </w:pPr>
-          <w:hyperlink w:anchor="_Toc223190857" w:history="1">
+          <w:hyperlink w:anchor="_Toc223193701" w:history="1">
             <w:r>
               <w:rPr>
                 <w:rStyle w:val="Lienhypertexte"/>
@@ -547,7 +619,7 @@
                 <w:noProof/>
                 <w:webHidden/>
               </w:rPr>
-              <w:instrText xml:space="preserve"> PAGEREF _Toc223190857 \h </w:instrText>
+              <w:instrText xml:space="preserve"> PAGEREF _Toc223193701 \h </w:instrText>
             </w:r>
             <w:r>
               <w:rPr>
@@ -590,7 +662,7 @@
               <w:lang w:eastAsia="fr-FR"/>
             </w:rPr>
           </w:pPr>
-          <w:hyperlink w:anchor="_Toc223190858" w:history="1">
+          <w:hyperlink w:anchor="_Toc223193702" w:history="1">
             <w:r>
               <w:rPr>
                 <w:rStyle w:val="Lienhypertexte"/>
@@ -617,7 +689,7 @@
                 <w:noProof/>
                 <w:webHidden/>
               </w:rPr>
-              <w:instrText xml:space="preserve"> PAGEREF _Toc223190858 \h </w:instrText>
+              <w:instrText xml:space="preserve"> PAGEREF _Toc223193702 \h </w:instrText>
             </w:r>
             <w:r>
               <w:rPr>
@@ -660,7 +732,7 @@
               <w:lang w:eastAsia="fr-FR"/>
             </w:rPr>
           </w:pPr>
-          <w:hyperlink w:anchor="_Toc223190859" w:history="1">
+          <w:hyperlink w:anchor="_Toc223193703" w:history="1">
             <w:r>
               <w:rPr>
                 <w:rStyle w:val="Lienhypertexte"/>
@@ -687,7 +759,7 @@
                 <w:noProof/>
                 <w:webHidden/>
               </w:rPr>
-              <w:instrText xml:space="preserve"> PAGEREF _Toc223190859 \h </w:instrText>
+              <w:instrText xml:space="preserve"> PAGEREF _Toc223193703 \h </w:instrText>
             </w:r>
             <w:r>
               <w:rPr>
@@ -730,7 +802,7 @@
               <w:lang w:eastAsia="fr-FR"/>
             </w:rPr>
           </w:pPr>
-          <w:hyperlink w:anchor="_Toc223190860" w:history="1">
+          <w:hyperlink w:anchor="_Toc223193704" w:history="1">
             <w:r>
               <w:rPr>
                 <w:rStyle w:val="Lienhypertexte"/>
@@ -757,7 +829,7 @@
                 <w:noProof/>
                 <w:webHidden/>
               </w:rPr>
-              <w:instrText xml:space="preserve"> PAGEREF _Toc223190860 \h </w:instrText>
+              <w:instrText xml:space="preserve"> PAGEREF _Toc223193704 \h </w:instrText>
             </w:r>
             <w:r>
               <w:rPr>
@@ -800,7 +872,7 @@
               <w:lang w:eastAsia="fr-FR"/>
             </w:rPr>
           </w:pPr>
-          <w:hyperlink w:anchor="_Toc223190861" w:history="1">
+          <w:hyperlink w:anchor="_Toc223193705" w:history="1">
             <w:r>
               <w:rPr>
                 <w:rStyle w:val="Lienhypertexte"/>
@@ -827,7 +899,7 @@
                 <w:noProof/>
                 <w:webHidden/>
               </w:rPr>
-              <w:instrText xml:space="preserve"> PAGEREF _Toc223190861 \h </w:instrText>
+              <w:instrText xml:space="preserve"> PAGEREF _Toc223193705 \h </w:instrText>
             </w:r>
             <w:r>
               <w:rPr>
@@ -870,7 +942,7 @@
               <w:lang w:eastAsia="fr-FR"/>
             </w:rPr>
           </w:pPr>
-          <w:hyperlink w:anchor="_Toc223190862" w:history="1">
+          <w:hyperlink w:anchor="_Toc223193706" w:history="1">
             <w:r>
               <w:rPr>
                 <w:rStyle w:val="Lienhypertexte"/>
@@ -897,7 +969,7 @@
                 <w:noProof/>
                 <w:webHidden/>
               </w:rPr>
-              <w:instrText xml:space="preserve"> PAGEREF _Toc223190862 \h </w:instrText>
+              <w:instrText xml:space="preserve"> PAGEREF _Toc223193706 \h </w:instrText>
             </w:r>
             <w:r>
               <w:rPr>
@@ -956,27 +1028,53 @@
       <w:pPr>
         <w:pStyle w:val="Titre2"/>
       </w:pPr>
-      <w:bookmarkStart w:id="0" w:name="_Toc223190851"/>
+      <w:bookmarkStart w:id="0" w:name="_Toc223193694"/>
       <w:r>
         <w:lastRenderedPageBreak/>
+        <w:t xml:space="preserve">Choix </w:t>
+      </w:r>
+      <w:r>
+        <w:t>techniques</w:t>
+      </w:r>
+      <w:bookmarkEnd w:id="0"/>
+    </w:p>
+    <w:p>
+      <w:r>
+        <w:t>Il n’y a pas eu de choix technique</w:t>
+      </w:r>
+      <w:r>
+        <w:t>s</w:t>
+      </w:r>
+      <w:r>
+        <w:t>, j’ai juste suivi ce qu’il fallait mettre en place via les consignes du TP.</w:t>
+      </w:r>
+    </w:p>
+    <w:p/>
+    <w:p>
+      <w:pPr>
+        <w:pStyle w:val="Titre2"/>
+      </w:pPr>
+      <w:bookmarkStart w:id="1" w:name="_Toc223193695"/>
+      <w:r>
         <w:t>VM-APP</w:t>
       </w:r>
-      <w:bookmarkEnd w:id="0"/>
+      <w:bookmarkEnd w:id="1"/>
     </w:p>
     <w:p>
       <w:pPr>
         <w:pStyle w:val="Titre3"/>
       </w:pPr>
-      <w:bookmarkStart w:id="1" w:name="_Toc223190852"/>
-      <w:proofErr w:type="spellStart"/>
+      <w:bookmarkStart w:id="2" w:name="_Toc223193696"/>
       <w:r>
         <w:t>Traefik</w:t>
       </w:r>
-      <w:bookmarkEnd w:id="1"/>
-      <w:proofErr w:type="spellEnd"/>
-    </w:p>
-    <w:p>
-      <w:r>
+      <w:bookmarkEnd w:id="2"/>
+    </w:p>
+    <w:p>
+      <w:r>
+        <w:rPr>
+          <w:noProof/>
+        </w:rPr>
         <w:drawing>
           <wp:inline distT="0" distB="0" distL="0" distR="0" wp14:anchorId="167B3FC8" wp14:editId="3D79FA6B">
             <wp:extent cx="5760720" cy="2807970"/>
@@ -1016,6 +1114,9 @@
     </w:p>
     <w:p>
       <w:r>
+        <w:rPr>
+          <w:noProof/>
+        </w:rPr>
         <w:drawing>
           <wp:inline distT="0" distB="0" distL="0" distR="0" wp14:anchorId="03020E95" wp14:editId="093A730C">
             <wp:extent cx="5760720" cy="2841625"/>
@@ -1062,17 +1163,18 @@
       <w:pPr>
         <w:pStyle w:val="Titre3"/>
       </w:pPr>
-      <w:bookmarkStart w:id="2" w:name="_Toc223190853"/>
-      <w:proofErr w:type="spellStart"/>
+      <w:bookmarkStart w:id="3" w:name="_Toc223193697"/>
       <w:r>
         <w:lastRenderedPageBreak/>
         <w:t>Keycloak</w:t>
       </w:r>
-      <w:bookmarkEnd w:id="2"/>
-      <w:proofErr w:type="spellEnd"/>
-    </w:p>
-    <w:p>
-      <w:r>
+      <w:bookmarkEnd w:id="3"/>
+    </w:p>
+    <w:p>
+      <w:r>
+        <w:rPr>
+          <w:noProof/>
+        </w:rPr>
         <w:drawing>
           <wp:inline distT="0" distB="0" distL="0" distR="0" wp14:anchorId="05D99701" wp14:editId="6CE7E69B">
             <wp:extent cx="5760720" cy="2739390"/>
@@ -1114,14 +1216,17 @@
       <w:pPr>
         <w:pStyle w:val="Titre3"/>
       </w:pPr>
-      <w:bookmarkStart w:id="3" w:name="_Toc223190854"/>
+      <w:bookmarkStart w:id="4" w:name="_Toc223193698"/>
       <w:r>
         <w:t>Wordpress</w:t>
       </w:r>
-      <w:bookmarkEnd w:id="3"/>
-    </w:p>
-    <w:p>
-      <w:r>
+      <w:bookmarkEnd w:id="4"/>
+    </w:p>
+    <w:p>
+      <w:r>
+        <w:rPr>
+          <w:noProof/>
+        </w:rPr>
         <w:drawing>
           <wp:inline distT="0" distB="0" distL="0" distR="0" wp14:anchorId="16A497F0" wp14:editId="6B3E4B2A">
             <wp:extent cx="5760720" cy="2827655"/>
@@ -1161,6 +1266,9 @@
     </w:p>
     <w:p>
       <w:r>
+        <w:rPr>
+          <w:noProof/>
+        </w:rPr>
         <w:drawing>
           <wp:inline distT="0" distB="0" distL="0" distR="0" wp14:anchorId="3A487823" wp14:editId="78E05A54">
             <wp:extent cx="5760720" cy="1715135"/>
@@ -1207,17 +1315,20 @@
       <w:pPr>
         <w:pStyle w:val="Titre3"/>
       </w:pPr>
-      <w:bookmarkStart w:id="4" w:name="_Toc223190855"/>
+      <w:bookmarkStart w:id="5" w:name="_Toc223193699"/>
       <w:proofErr w:type="gramStart"/>
       <w:r>
         <w:lastRenderedPageBreak/>
         <w:t>phpMyAdmin</w:t>
       </w:r>
-      <w:bookmarkEnd w:id="4"/>
+      <w:bookmarkEnd w:id="5"/>
       <w:proofErr w:type="gramEnd"/>
     </w:p>
     <w:p>
       <w:r>
+        <w:rPr>
+          <w:noProof/>
+        </w:rPr>
         <w:drawing>
           <wp:inline distT="0" distB="0" distL="0" distR="0" wp14:anchorId="6323B654" wp14:editId="3BB5C452">
             <wp:extent cx="4286848" cy="2238687"/>
@@ -1257,6 +1368,9 @@
     </w:p>
     <w:p>
       <w:r>
+        <w:rPr>
+          <w:noProof/>
+        </w:rPr>
         <w:drawing>
           <wp:inline distT="0" distB="0" distL="0" distR="0" wp14:anchorId="27D10811" wp14:editId="0E4313A0">
             <wp:extent cx="5760720" cy="2366010"/>
@@ -1303,32 +1417,28 @@
       <w:pPr>
         <w:pStyle w:val="Titre2"/>
       </w:pPr>
-      <w:bookmarkStart w:id="5" w:name="_Toc223190856"/>
+      <w:bookmarkStart w:id="6" w:name="_Toc223193700"/>
       <w:r>
         <w:lastRenderedPageBreak/>
-        <w:t>VM-</w:t>
-      </w:r>
-      <w:proofErr w:type="spellStart"/>
-      <w:r>
-        <w:t>logging</w:t>
-      </w:r>
-      <w:bookmarkEnd w:id="5"/>
-      <w:proofErr w:type="spellEnd"/>
+        <w:t>VM-logging</w:t>
+      </w:r>
+      <w:bookmarkEnd w:id="6"/>
     </w:p>
     <w:p>
       <w:pPr>
         <w:pStyle w:val="Titre3"/>
       </w:pPr>
-      <w:bookmarkStart w:id="6" w:name="_Toc223190857"/>
-      <w:proofErr w:type="spellStart"/>
+      <w:bookmarkStart w:id="7" w:name="_Toc223193701"/>
       <w:r>
         <w:t>Traefik</w:t>
       </w:r>
-      <w:bookmarkEnd w:id="6"/>
-      <w:proofErr w:type="spellEnd"/>
-    </w:p>
-    <w:p>
-      <w:r>
+      <w:bookmarkEnd w:id="7"/>
+    </w:p>
+    <w:p>
+      <w:r>
+        <w:rPr>
+          <w:noProof/>
+        </w:rPr>
         <w:drawing>
           <wp:inline distT="0" distB="0" distL="0" distR="0" wp14:anchorId="13DF411E" wp14:editId="745FC25B">
             <wp:extent cx="5760720" cy="1826895"/>
@@ -1371,16 +1481,17 @@
       <w:pPr>
         <w:pStyle w:val="Titre3"/>
       </w:pPr>
-      <w:bookmarkStart w:id="7" w:name="_Toc223190858"/>
-      <w:proofErr w:type="spellStart"/>
+      <w:bookmarkStart w:id="8" w:name="_Toc223193702"/>
       <w:r>
         <w:t>Kibana</w:t>
       </w:r>
-      <w:bookmarkEnd w:id="7"/>
-      <w:proofErr w:type="spellEnd"/>
-    </w:p>
-    <w:p>
-      <w:r>
+      <w:bookmarkEnd w:id="8"/>
+    </w:p>
+    <w:p>
+      <w:r>
+        <w:rPr>
+          <w:noProof/>
+        </w:rPr>
         <w:drawing>
           <wp:inline distT="0" distB="0" distL="0" distR="0" wp14:anchorId="76F4D7C0" wp14:editId="181529C3">
             <wp:extent cx="5760720" cy="2013585"/>
@@ -1420,6 +1531,9 @@
     </w:p>
     <w:p>
       <w:r>
+        <w:rPr>
+          <w:noProof/>
+        </w:rPr>
         <w:drawing>
           <wp:inline distT="0" distB="0" distL="0" distR="0" wp14:anchorId="03EC8DF8" wp14:editId="3B66981D">
             <wp:extent cx="5760720" cy="2708275"/>
@@ -1466,17 +1580,18 @@
       <w:pPr>
         <w:pStyle w:val="Titre3"/>
       </w:pPr>
-      <w:bookmarkStart w:id="8" w:name="_Toc223190859"/>
-      <w:proofErr w:type="spellStart"/>
+      <w:bookmarkStart w:id="9" w:name="_Toc223193703"/>
       <w:r>
         <w:lastRenderedPageBreak/>
         <w:t>Elasticsearch</w:t>
       </w:r>
-      <w:bookmarkEnd w:id="8"/>
-      <w:proofErr w:type="spellEnd"/>
-    </w:p>
-    <w:p>
-      <w:r>
+      <w:bookmarkEnd w:id="9"/>
+    </w:p>
+    <w:p>
+      <w:r>
+        <w:rPr>
+          <w:noProof/>
+        </w:rPr>
         <w:drawing>
           <wp:inline distT="0" distB="0" distL="0" distR="0" wp14:anchorId="45831C32" wp14:editId="37830A0A">
             <wp:extent cx="4248743" cy="2981741"/>
@@ -1523,12 +1638,12 @@
       <w:pPr>
         <w:pStyle w:val="Titre2"/>
       </w:pPr>
-      <w:bookmarkStart w:id="9" w:name="_Toc223190860"/>
+      <w:bookmarkStart w:id="10" w:name="_Toc223193704"/>
       <w:r>
         <w:lastRenderedPageBreak/>
         <w:t>VM-monitoring</w:t>
       </w:r>
-      <w:bookmarkEnd w:id="9"/>
+      <w:bookmarkEnd w:id="10"/>
     </w:p>
     <w:p>
       <w:pPr>
@@ -1537,16 +1652,17 @@
           <w:rStyle w:val="Titre3Car"/>
         </w:rPr>
       </w:pPr>
-      <w:bookmarkStart w:id="10" w:name="_Toc223190861"/>
-      <w:proofErr w:type="spellStart"/>
+      <w:bookmarkStart w:id="11" w:name="_Toc223193705"/>
       <w:r>
         <w:t>Traefik</w:t>
       </w:r>
-      <w:bookmarkEnd w:id="10"/>
-      <w:proofErr w:type="spellEnd"/>
-    </w:p>
-    <w:p>
-      <w:r>
+      <w:bookmarkEnd w:id="11"/>
+    </w:p>
+    <w:p>
+      <w:r>
+        <w:rPr>
+          <w:noProof/>
+        </w:rPr>
         <w:drawing>
           <wp:inline distT="0" distB="0" distL="0" distR="0" wp14:anchorId="3FD2BAF3" wp14:editId="4A6F203A">
             <wp:extent cx="5760720" cy="2812415"/>
@@ -1589,19 +1705,20 @@
       <w:pPr>
         <w:pStyle w:val="Titre3"/>
       </w:pPr>
-      <w:bookmarkStart w:id="11" w:name="_Toc223190862"/>
-      <w:proofErr w:type="spellStart"/>
+      <w:bookmarkStart w:id="12" w:name="_Toc223193706"/>
       <w:r>
         <w:t>U</w:t>
       </w:r>
       <w:r>
         <w:t>ptimekuma</w:t>
       </w:r>
-      <w:bookmarkEnd w:id="11"/>
-      <w:proofErr w:type="spellEnd"/>
-    </w:p>
-    <w:p>
-      <w:r>
+      <w:bookmarkEnd w:id="12"/>
+    </w:p>
+    <w:p>
+      <w:r>
+        <w:rPr>
+          <w:noProof/>
+        </w:rPr>
         <w:drawing>
           <wp:inline distT="0" distB="0" distL="0" distR="0" wp14:anchorId="70C5BAF8" wp14:editId="4F379683">
             <wp:extent cx="5760720" cy="2828290"/>

</xml_diff>